<commit_message>
Restructure Unbowed dissertations with introduction (subject, opinion, two arguments) and conclusion
Co-authored-by: JuicyD1 <JuicyD1@users.noreply.github.com>
</commit_message>
<xml_diff>
--- a/Dissertations_Unbowed_3_Questions_604ESH_Adam_Attia.docx
+++ b/Dissertations_Unbowed_3_Questions_604ESH_Adam_Attia.docx
@@ -91,7 +91,7 @@
         <w:rPr>
           <w:b w:val="0"/>
         </w:rPr>
-        <w:t xml:space="preserve">Before reading </w:t>
+        <w:t xml:space="preserve">In </w:t>
       </w:r>
       <w:r>
         <w:rPr>
@@ -104,7 +104,7 @@
         <w:rPr>
           <w:b w:val="0"/>
         </w:rPr>
-        <w:t>, I saw workplace values as rules written by employers: arrive on time, follow procedures, respect the hierarchy. The event that changed this view is in Chapter 6, "Foresters Without Diplomas." In 1977, after the first public tree planting in Kamukunji Park in Nairobi, Wangari Maathai and the National Council of Women of Kenya began encouraging rural women to plant trees to fight deforestation, soil erosion and the lack of firewood. Maathai asked the Department of Forestry for help. The professional foresters first offered free seedlings, then withdrew the offer when the demand grew too fast, and they told her that growing trees was a technical job that needed a diploma. Maathai and the women decided to do it themselves. They set up community nurseries, collected seeds, observed how trees reproduce naturally and learned by trial and error. To make the work serious, the movement paid each woman a small amount for every seedling that was still alive after several months, verified by Green Belt staff.</w:t>
+        <w:t>, Wangari Maathai tells how she founded the Green Belt Movement in Kenya in 1977. In Chapter 6, "Foresters Without Diplomas," the government foresters refuse to train the rural women who want to plant trees, and the women succeed on their own. In my opinion, this event changed my perception of workplace values and responsibilities more than any other in the book. First, it showed me that responsibility is measured by verified results, not by promises. Second, it showed me that values do not come from the hierarchy or from credentials, but from the people who keep their word.</w:t>
       </w:r>
     </w:p>
     <w:p>
@@ -116,7 +116,31 @@
         <w:rPr>
           <w:b w:val="0"/>
         </w:rPr>
-        <w:t>This event changed my perception of workplace values in three ways. First, responsibility is measured by results that can be checked, not by promises. The women were not paid for planting; they were paid for trees that survived. As a future electrical technician, this is exactly what commissioning means: a system is not finished when it is wired, it is finished when it is tested and documented. Second, values do not come only from the top. The Department of Forestry, the official institution, broke its promise, while women with no formal schooling kept theirs. Third, respect is a workplace value. The experts dismissed the women because of their lack of credentials, and they were wrong. Since reading this chapter, I see that my future responsibilities include listening to the people who do the work, verifying what I deliver and keeping my word even when the institution above me does not.</w:t>
+        <w:t>My first argument is that the episode redefines responsibility. After the first tree planting in Kamukunji Park, Nairobi, Maathai asked the Department of Forestry for help. The foresters said that growing trees was a technical job that required a diploma. The women set up their own nurseries, observed how seeds germinate in nature and learned by trial and error. The movement then paid each woman a small amount only for the seedlings that were still alive after several months, checked by Green Belt staff. The women were not paid for planting; they were paid for trees that survived. As a future electrical technician, this is exactly what commissioning means: a system is not finished when it is wired, it is finished when it is tested and documented.</w:t>
+      </w:r>
+    </w:p>
+    <w:p>
+      <w:pPr>
+        <w:spacing w:line="480" w:lineRule="auto"/>
+        <w:ind w:firstLine="720"/>
+      </w:pPr>
+      <w:r>
+        <w:rPr>
+          <w:b w:val="0"/>
+        </w:rPr>
+        <w:t>My second argument is that values come from people, not from positions. The Department of Forestry, the official institution, first offered free seedlings and then withdrew the offer when demand grew. Women with no formal schooling kept their commitments while the experts broke theirs and looked down on them. This taught me that respect for the people who do the work is a value, and that I must keep my word even when the institution above me does not.</w:t>
+      </w:r>
+    </w:p>
+    <w:p>
+      <w:pPr>
+        <w:spacing w:line="480" w:lineRule="auto"/>
+        <w:ind w:firstLine="720"/>
+      </w:pPr>
+      <w:r>
+        <w:rPr>
+          <w:b w:val="0"/>
+        </w:rPr>
+        <w:t>In conclusion, the "foresters without diplomas" changed how I see my future responsibilities: verify what I deliver, respect the people who do the work, and keep my commitments.</w:t>
       </w:r>
     </w:p>
     <w:p>
@@ -127,7 +151,7 @@
         <w:rPr>
           <w:i/>
         </w:rPr>
-        <w:t>(318 words)</w:t>
+        <w:t>(334 words)</w:t>
       </w:r>
     </w:p>
     <w:p>
@@ -224,7 +248,7 @@
         <w:rPr>
           <w:b w:val="0"/>
         </w:rPr>
-        <w:t>, Wangari Maathai calls the rural women of the Green Belt Movement "foresters without diplomas." The government foresters had told her that planting trees required professional training and complicated techniques that farm women could not master. The women proved them wrong: they watched how seeds germinated in nature, tried different methods, failed, adjusted and eventually ran nurseries that produced thousands of healthy seedlings. This episode changed what I think competence is.</w:t>
+        <w:t>, the Kenyan government foresters tell Wangari Maathai that planting trees requires a diploma and complicated techniques that farm women cannot master. The women prove them wrong and become what Maathai calls "foresters without diplomas." In my opinion, this episode changed my definition of competence: competence is not a credential, it is a verified ability to do the job and to know one's limits. First, the episode proves logically that a diploma neither guarantees nor replaces competence. Second, it changed the meaning I give to my own future certification.</w:t>
       </w:r>
     </w:p>
     <w:p>
@@ -236,7 +260,7 @@
         <w:rPr>
           <w:b w:val="0"/>
         </w:rPr>
-        <w:t>Before, I defined competence by the paper that certifies it. I am studying electrical engineering technology to get a diploma, and I assumed that the diploma would be the proof that I am competent. Maathai's women forced me to define competence by negation: competence is not the diploma. The diploma is a promise made to the public that someone has verified my skills; the competence itself is the ability to do the job safely and to know my limits. Logically, if a diploma guaranteed competence, the foresters would have grown better trees than the women, and if the absence of a diploma meant incompetence, the nurseries would have failed. Neither happened.</w:t>
+        <w:t>My first argument is logical. Before reading this chapter, I defined competence by the paper that certifies it, since I am studying electrical engineering technology to obtain a diploma. The women forced me to define competence by negation: competence is not the diploma. If a diploma guaranteed competence, the foresters would have grown better trees than the women; if the absence of a diploma meant incompetence, the nurseries would have failed. Neither happened. The women watched how seeds germinated, tried different methods, failed, adjusted and produced thousands of healthy seedlings. Competence was in the result, not in the title.</w:t>
       </w:r>
     </w:p>
     <w:p>
@@ -248,7 +272,19 @@
         <w:rPr>
           <w:b w:val="0"/>
         </w:rPr>
-        <w:t>This does not mean credentials are useless. The OACETT Code of Ethics says a technician must accept assignments only when qualified by training or experience. The key words are "or experience." A certification protects the public because it is checked; it does not make me better than an electrician who has pulled cable for twenty years without a college degree. In my future workplace, competence will mean three things: knowing what I can and cannot do, listening to experienced workers whatever their title, and verifying my results instead of trusting my credentials. The foresters had diplomas and arrogance; the women had observation, humility and surviving trees. I now know which kind of competence I want.</w:t>
+        <w:t>My second argument concerns my own certification. This does not mean credentials are useless. The OACETT Code of Ethics says a technician must accept assignments only when qualified "by training or experience." A certification protects the public because someone has checked my skills; it does not make me better than an electrician who has pulled cable for twenty years without a college degree. In my future workplace, competence will mean knowing what I can and cannot do, listening to experienced workers whatever their title, and verifying my results instead of trusting my credentials.</w:t>
+      </w:r>
+    </w:p>
+    <w:p>
+      <w:pPr>
+        <w:spacing w:line="480" w:lineRule="auto"/>
+        <w:ind w:firstLine="720"/>
+      </w:pPr>
+      <w:r>
+        <w:rPr>
+          <w:b w:val="0"/>
+        </w:rPr>
+        <w:t>In conclusion, the foresters had diplomas and arrogance; the women had observation, humility and surviving trees. The episode taught me which kind of competence I want to have.</w:t>
       </w:r>
     </w:p>
     <w:p>
@@ -259,7 +295,7 @@
         <w:rPr>
           <w:i/>
         </w:rPr>
-        <w:t>(301 words)</w:t>
+        <w:t>(313 words)</w:t>
       </w:r>
     </w:p>
     <w:p>
@@ -343,7 +379,7 @@
         <w:rPr>
           <w:b w:val="0"/>
         </w:rPr>
-        <w:t xml:space="preserve">Integrity is easy to talk about when it costs nothing. Chapter 7 of </w:t>
+        <w:t xml:space="preserve">Chapter 7 of </w:t>
       </w:r>
       <w:r>
         <w:rPr>
@@ -356,7 +392,7 @@
         <w:rPr>
           <w:b w:val="0"/>
         </w:rPr>
-        <w:t>, "Difficult Years," shows what it costs when it is real. After her husband filed for divorce, Wangari Maathai lost the case in court. In a magazine interview she said that the judge must have been either incompetent or corrupt. She was charged with contempt of court, sentenced to six months and sent to Lang'ata Women's Prison; she was released after a few days only when her lawyer issued a statement on her behalf. Then, in 1982, she resigned from her position at the University of Nairobi to run for Parliament in her home region. She was disqualified on a technicality before the vote, and the university refused to give her job back. In a short time she lost her salary, her university housing and her professional status, while raising three children.</w:t>
+        <w:t>, "Difficult Years," describes two blows in Wangari Maathai's life: her imprisonment for contempt of court after her divorce trial, and the loss of her university job in 1982. In my opinion, these events show that integrity at work has a real price, and that this price is exactly what gives integrity its value. First, her imprisonment shows the cost of telling the truth to authority. Second, her job loss shows the cost of acting on one's convictions instead of protecting one's position.</w:t>
       </w:r>
     </w:p>
     <w:p>
@@ -368,7 +404,7 @@
         <w:rPr>
           <w:b w:val="0"/>
         </w:rPr>
-        <w:t>These two events show the cost of integrity at work in a concrete way. Maathai could have stayed quiet about the judge, and she could have kept her safe university position instead of trying to serve her community in politics. She chose to say what she believed and to act on it, and the institutions punished her for it. What impressed me is that she did not become bitter or dishonest; she put her energy into the Green Belt Movement, which grew into a national organization.</w:t>
+        <w:t>My first argument is her imprisonment. After losing her divorce case, Maathai said in a magazine interview that the judge must have been either incompetent or corrupt. She was charged with contempt of court, sentenced to six months and sent to Lang'ata Women's Prison; she was released after a few days only when her lawyer issued a statement on her behalf. She could have stayed quiet. She chose to say what she believed, and the justice system punished her for it. In a workplace, telling a supervisor that an installation is not up to code can also be punished, but the OACETT code says I must present the consequences clearly even when my judgement is overruled.</w:t>
       </w:r>
     </w:p>
     <w:p>
@@ -380,7 +416,19 @@
         <w:rPr>
           <w:b w:val="0"/>
         </w:rPr>
-        <w:t>As a future electrical technician, I will face smaller versions of these choices. Refusing to sign a report for a panel I did not test, or telling a supervisor that an installation is not up to code, can cost me a contract or a promotion. The OACETT code says I must present the consequences clearly even when my judgement is overruled. Maathai shows that integrity is measured by what you are willing to lose. If my values only hold when they are free, they are preferences, not values.</w:t>
+        <w:t>My second argument is her job loss. In 1982, Maathai resigned from the University of Nairobi to run for Parliament in her home region. She was disqualified on a technicality, and the university refused to give her job back. She lost her salary, her university housing and her status while raising three children. She did not become bitter or dishonest; she put her energy into the Green Belt Movement. As a future electrical technician, refusing to sign a report for a panel I did not test may cost me a contract, but Maathai shows that integrity is measured by what you are willing to lose.</w:t>
+      </w:r>
+    </w:p>
+    <w:p>
+      <w:pPr>
+        <w:spacing w:line="480" w:lineRule="auto"/>
+        <w:ind w:firstLine="720"/>
+      </w:pPr>
+      <w:r>
+        <w:rPr>
+          <w:b w:val="0"/>
+        </w:rPr>
+        <w:t>In conclusion, if my values only hold when they are free, they are preferences, not values. Maathai's prison cell and lost job prove that hers were values.</w:t>
       </w:r>
     </w:p>
     <w:p>
@@ -391,7 +439,7 @@
         <w:rPr>
           <w:i/>
         </w:rPr>
-        <w:t>(319 words)</w:t>
+        <w:t>(334 words)</w:t>
       </w:r>
     </w:p>
     <w:sectPr>

</xml_diff>